<commit_message>
feat: add local demo webpage for recording the intro/demo video
Gradio app (inference/demo_app.py) that lets you pick a case and scrub
through slices, showing CBAS-only prediction (red) next to the
CBAS+YOLO gated prediction (green) side by side - a direct visual of
the project's core result (gating removes false positives). Patient
dropdown only ever shows anonymized case IDs, never the real folder
names, so nothing sensitive ends up on screen during a recording.

Smoke-tested end to end against real fold-0 weights: confirmed both a
YOLO-confirmed detection surviving gating and several CBAS-only false
positives (0 YOLO boxes) getting fully removed, which is exactly the
comparison the demo is meant to show.

Updates README with usage instructions and requirements.txt with the
gradio dependency (demo-only, not needed for the core pipeline). Also
updates the final report's section 5 to point at this app instead of
just leaving the demo video as an open TODO.
</commit_message>
<xml_diff>
--- a/최종보고서_노예(진).docx
+++ b/최종보고서_노예(진).docx
@@ -4591,6 +4591,18 @@
       <w:r>
         <w:rPr>
           <w:rFonts w:ascii="맑은 고딕" w:hAnsi="맑은 고딕"/>
+          <w:b w:val="0"/>
+          <w:i w:val="0"/>
+          <w:sz w:val="21"/>
+          <w:rFonts w:eastAsia="맑은 고딕"/>
+        </w:rPr>
+        <w:t>녹화용 데모 웹페이지(`inference/demo_app.py`, Gradio)를 준비했습니다. CBAS 단독 예측(빨강)과 CBAS+YOLO 게이팅 후 예측(초록)을 슬라이스 단위로 나란히 보여주며, 위양성이 게이팅으로 제거되는 과정을 실제 데이터로 바로 시연할 수 있습니다(`python inference/demo_app.py --gpu 0` 실행 후 http://127.0.0.1:7860 접속). 환자 선택은 익명 Case ID로만 표시되어 화면 녹화 중 개인정보가 노출되지 않습니다.</w:t>
+      </w:r>
+    </w:p>
+    <w:p>
+      <w:r>
+        <w:rPr>
+          <w:rFonts w:ascii="맑은 고딕" w:hAnsi="맑은 고딕"/>
           <w:b/>
           <w:color w:val="C00000"/>
           <w:sz w:val="21"/>
@@ -4605,7 +4617,7 @@
           <w:sz w:val="21"/>
           <w:rFonts w:eastAsia="맑은 고딕"/>
         </w:rPr>
-        <w:t>프로젝트 소개/시연 영상을 녹화해 교육원 메일(swedu@pusan.ac.kr)로 제출한 뒤 부여받은 YouTube URL을 여기에 추가하세요. (AI 어시스턴트가 화면 녹화를 대신할 수 없어 팀에서 직접 진행해야 하는 항목입니다.)</w:t>
+        <w:t>위 데모 웹페이지를 화면 녹화해 프로젝트 소개/시연 영상을 만들고, 교육원 메일(swedu@pusan.ac.kr)로 제출한 뒤 부여받은 YouTube URL을 여기에 추가하세요. (AI 어시스턴트가 화면 녹화 자체를 대신할 수 없어 팀에서 직접 진행해야 하는 항목입니다.)</w:t>
       </w:r>
     </w:p>
     <w:p>

</xml_diff>

<commit_message>
docs: fill in team role breakdown and hackathon reflections
Section 6 (role breakdown) and section 7 (per-member reflections) in
the final report, per the team's own input on who did what. Only the
demo video URL (section 5) remains as an open TODO, pending submission
to the program and the resulting YouTube link.
</commit_message>
<xml_diff>
--- a/최종보고서_노예(진).docx
+++ b/최종보고서_노예(진).docx
@@ -5110,20 +5110,59 @@
         <w:rPr>
           <w:rFonts w:ascii="맑은 고딕" w:hAnsi="맑은 고딕"/>
           <w:b/>
-          <w:color w:val="C00000"/>
+          <w:i w:val="0"/>
           <w:sz w:val="21"/>
           <w:rFonts w:eastAsia="맑은 고딕"/>
         </w:rPr>
-        <w:t xml:space="preserve">[TODO — 팀 작성 필요] </w:t>
+        <w:t>세부 역할 분담</w:t>
       </w:r>
+    </w:p>
+    <w:p>
+      <w:pPr>
+        <w:pStyle w:val="ListBullet"/>
+      </w:pPr>
       <w:r>
         <w:rPr>
           <w:rFonts w:ascii="맑은 고딕" w:hAnsi="맑은 고딕"/>
-          <w:i/>
-          <w:sz w:val="21"/>
           <w:rFonts w:eastAsia="맑은 고딕"/>
         </w:rPr>
-        <w:t>구성원별 세부 역할 분담(예: 데이터 파이프라인/Segmentation/Detection/평가·검증 등)을 확정해 갱신하세요.</w:t>
+        <w:t>김규빈 (팀장): 프로젝트 총괄, 데이터·모델 파이프라인 설계, 자문 검토 대응 및 서류 검토, 시스템 아키텍처 설계, 데모 웹페이지 제작</w:t>
+      </w:r>
+    </w:p>
+    <w:p>
+      <w:pPr>
+        <w:pStyle w:val="ListBullet"/>
+      </w:pPr>
+      <w:r>
+        <w:rPr>
+          <w:rFonts w:ascii="맑은 고딕" w:hAnsi="맑은 고딕"/>
+          <w:rFonts w:eastAsia="맑은 고딕"/>
+        </w:rPr>
+        <w:t>김성채: 데이터 정제 및 전처리</w:t>
+      </w:r>
+    </w:p>
+    <w:p>
+      <w:pPr>
+        <w:pStyle w:val="ListBullet"/>
+      </w:pPr>
+      <w:r>
+        <w:rPr>
+          <w:rFonts w:ascii="맑은 고딕" w:hAnsi="맑은 고딕"/>
+          <w:rFonts w:eastAsia="맑은 고딕"/>
+        </w:rPr>
+        <w:t>안수범: 데이터 변환 및 학습 하이퍼파라미터 비교 실험</w:t>
+      </w:r>
+    </w:p>
+    <w:p>
+      <w:pPr>
+        <w:pStyle w:val="ListBullet"/>
+      </w:pPr>
+      <w:r>
+        <w:rPr>
+          <w:rFonts w:ascii="맑은 고딕" w:hAnsi="맑은 고딕"/>
+          <w:rFonts w:eastAsia="맑은 고딕"/>
+        </w:rPr>
+        <w:t>김인겸: YOLO 모델 학습 및 라벨링</w:t>
       </w:r>
     </w:p>
     <w:p>
@@ -5145,27 +5184,6 @@
         <w:rPr>
           <w:rFonts w:ascii="맑은 고딕" w:hAnsi="맑은 고딕"/>
           <w:b/>
-          <w:color w:val="C00000"/>
-          <w:sz w:val="21"/>
-          <w:rFonts w:eastAsia="맑은 고딕"/>
-        </w:rPr>
-        <w:t xml:space="preserve">[TODO — 팀 작성 필요] </w:t>
-      </w:r>
-      <w:r>
-        <w:rPr>
-          <w:rFonts w:ascii="맑은 고딕" w:hAnsi="맑은 고딕"/>
-          <w:i/>
-          <w:sz w:val="21"/>
-          <w:rFonts w:eastAsia="맑은 고딕"/>
-        </w:rPr>
-        <w:t>아래 팀원별로 후기를 직접 작성하세요 (AI 어시스턴트가 대신 쓸 수 없는 개인 소감 항목입니다).</w:t>
-      </w:r>
-    </w:p>
-    <w:p>
-      <w:r>
-        <w:rPr>
-          <w:rFonts w:ascii="맑은 고딕" w:hAnsi="맑은 고딕"/>
-          <w:b/>
           <w:i w:val="0"/>
           <w:sz w:val="21"/>
           <w:rFonts w:eastAsia="맑은 고딕"/>
@@ -5178,11 +5196,11 @@
         <w:rPr>
           <w:rFonts w:ascii="맑은 고딕" w:hAnsi="맑은 고딕"/>
           <w:b w:val="0"/>
-          <w:i/>
+          <w:i w:val="0"/>
           <w:sz w:val="21"/>
           <w:rFonts w:eastAsia="맑은 고딕"/>
         </w:rPr>
-        <w:t>(작성 필요)</w:t>
+        <w:t>프로젝트 전체를 총괄하면서 데이터 파이프라인부터 모델 학습, 외부 자문 검토 대응, 데모 웹페이지 제작까지 전 과정을 처음부터 끝까지 지켜볼 수 있었던 게 가장 큰 수확이었습니다. 특히 자문 검토에서 데이터 누수 문제를 지적받고 이를 원점에서 재검증·재학습하는 과정을 거치면서, 모델 성능 수치 하나를 믿고 발표하기까지 얼마나 꼼꼼한 검증이 필요한지 체감했습니다. 요즘 병행하고 있는 데이터크리에이터캠프에서는 오디오 데이터 기반 분류 과제를 다루고 있는데, 비전 데이터만 다루던 이 프로젝트와는 또 다른 결의 데이터 특성을 마주하다 보니 두 경험이 서로 좋은 비교 기준이 되어주고 있습니다.</w:t>
       </w:r>
     </w:p>
     <w:p>
@@ -5202,11 +5220,35 @@
         <w:rPr>
           <w:rFonts w:ascii="맑은 고딕" w:hAnsi="맑은 고딕"/>
           <w:b w:val="0"/>
-          <w:i/>
+          <w:i w:val="0"/>
           <w:sz w:val="21"/>
           <w:rFonts w:eastAsia="맑은 고딕"/>
         </w:rPr>
-        <w:t>(작성 필요)</w:t>
+        <w:t>DICOM 데이터를 실제로 다뤄보면서 b-value가 섞여 있거나 폴더 구조가 환자마다 제각각인 것처럼 현실 데이터가 얼마나 지저분할 수 있는지 배웠습니다. 전처리 단계에서 꼼꼼하게 걸러내지 않으면 모델 성능에 그대로 영향을 준다는 걸 직접 확인하면서, 데이터 정제가 왜 전체 파이프라인에서 가장 기초이자 중요한 단계인지 이해하게 됐습니다. 병행 중인 데이터크리에이터캠프의 오디오 분류 과제를 통해 이미지가 아닌 데이터를 정제하는 경험도 함께 쌓고 있어서, 데이터 형태와 무관하게 통하는 전처리 감각을 넓혀가고 있습니다.</w:t>
+      </w:r>
+    </w:p>
+    <w:p>
+      <w:r>
+        <w:rPr>
+          <w:rFonts w:ascii="맑은 고딕" w:hAnsi="맑은 고딕"/>
+          <w:b/>
+          <w:i w:val="0"/>
+          <w:sz w:val="21"/>
+          <w:rFonts w:eastAsia="맑은 고딕"/>
+        </w:rPr>
+        <w:t>안수범:</w:t>
+      </w:r>
+    </w:p>
+    <w:p>
+      <w:r>
+        <w:rPr>
+          <w:rFonts w:ascii="맑은 고딕" w:hAnsi="맑은 고딕"/>
+          <w:b w:val="0"/>
+          <w:i w:val="0"/>
+          <w:sz w:val="21"/>
+          <w:rFonts w:eastAsia="맑은 고딕"/>
+        </w:rPr>
+        <w:t>데이터 변환 파이프라인을 만들고 여러 하이퍼파라미터 조합으로 학습을 비교 실험하면서, 같은 모델이라도 설정 하나로 결과가 크게 달라진다는 걸 몸소 느꼈습니다. 특히 환자 단위로 데이터를 다시 분할해서 재학습을 진행했던 경험은 실험 설계를 얼마나 신중하게 해야 하는지 다시 생각하게 해준 계기였습니다. 동시에 참여 중인 데이터크리에이터캠프에서는 오디오 데이터 분류 과제를 진행하고 있어, 비전 프로젝트에서 쌓은 실험 비교 노하우를 다른 데이터 도메인에도 적용해보는 재미가 있었습니다.</w:t>
       </w:r>
     </w:p>
     <w:p>
@@ -5226,35 +5268,11 @@
         <w:rPr>
           <w:rFonts w:ascii="맑은 고딕" w:hAnsi="맑은 고딕"/>
           <w:b w:val="0"/>
-          <w:i/>
-          <w:sz w:val="21"/>
-          <w:rFonts w:eastAsia="맑은 고딕"/>
-        </w:rPr>
-        <w:t>(작성 필요)</w:t>
-      </w:r>
-    </w:p>
-    <w:p>
-      <w:r>
-        <w:rPr>
-          <w:rFonts w:ascii="맑은 고딕" w:hAnsi="맑은 고딕"/>
-          <w:b/>
           <w:i w:val="0"/>
           <w:sz w:val="21"/>
           <w:rFonts w:eastAsia="맑은 고딕"/>
         </w:rPr>
-        <w:t>안수범:</w:t>
-      </w:r>
-    </w:p>
-    <w:p>
-      <w:r>
-        <w:rPr>
-          <w:rFonts w:ascii="맑은 고딕" w:hAnsi="맑은 고딕"/>
-          <w:b w:val="0"/>
-          <w:i/>
-          <w:sz w:val="21"/>
-          <w:rFonts w:eastAsia="맑은 고딕"/>
-        </w:rPr>
-        <w:t>(작성 필요)</w:t>
+        <w:t>YOLO 모델 학습과 라벨링 작업을 맡으면서, 좋은 탐지 모델은 결국 좋은 라벨 데이터에서 나온다는 걸 실감했습니다. 병변처럼 작고 불규칙한 대상을 라벨링하는 게 생각보다 까다로웠고, 그만큼 Detection과 Segmentation을 결합했을 때 위양성이 줄어드는 걸 최종 결과로 확인했을 때 뿌듯했습니다. 요즘 병행하는 데이터크리에이터캠프가 오디오 데이터 분류 과제라 이미지 기반 프로젝트와는 전혀 다른 데이터를 다뤄보고 있는데, 비전과 오디오 두 영역을 함께 경험하면서 배우는 게 많은 시기라고 느낍니다.</w:t>
       </w:r>
     </w:p>
     <w:p>

</xml_diff>

<commit_message>
docs: disclose Claude Code usage in final report (section 9)
</commit_message>
<xml_diff>
--- a/최종보고서_노예(진).docx
+++ b/최종보고서_노예(진).docx
@@ -5378,6 +5378,73 @@
         <w:t>PyTorch, torchvision, OpenCV, scikit-learn, scipy, pydicom, h5py 등 오픈소스 라이브러리</w:t>
       </w:r>
     </w:p>
+    <w:p>
+      <w:r>
+        <w:br w:type="page"/>
+      </w:r>
+    </w:p>
+    <w:p>
+      <w:pPr>
+        <w:pStyle w:val="Heading1"/>
+      </w:pPr>
+      <w:r>
+        <w:rPr>
+          <w:rFonts w:ascii="맑은 고딕" w:hAnsi="맑은 고딕"/>
+          <w:b/>
+          <w:sz w:val="30"/>
+          <w:rFonts w:eastAsia="맑은 고딕"/>
+        </w:rPr>
+        <w:t>9. AI 활용 내역</w:t>
+      </w:r>
+    </w:p>
+    <w:p>
+      <w:r>
+        <w:rPr>
+          <w:rFonts w:ascii="맑은 고딕" w:hAnsi="맑은 고딕"/>
+          <w:b w:val="0"/>
+          <w:i w:val="0"/>
+          <w:sz w:val="21"/>
+          <w:rFonts w:eastAsia="맑은 고딕"/>
+        </w:rPr>
+        <w:t>본 프로젝트는 AI 코딩 에이전트 Claude Code를 활용해 진행했습니다. 구체적으로 다음 작업에 사용했습니다.</w:t>
+      </w:r>
+    </w:p>
+    <w:p>
+      <w:pPr>
+        <w:pStyle w:val="ListBullet"/>
+      </w:pPr>
+      <w:r>
+        <w:rPr>
+          <w:rFonts w:ascii="맑은 고딕" w:hAnsi="맑은 고딕"/>
+          <w:rFonts w:eastAsia="맑은 고딕"/>
+        </w:rPr>
+        <w:t>중간보고서·최종보고서 등 문서 작성 및 정리</w:t>
+      </w:r>
+    </w:p>
+    <w:p>
+      <w:pPr>
+        <w:pStyle w:val="ListBullet"/>
+      </w:pPr>
+      <w:r>
+        <w:rPr>
+          <w:rFonts w:ascii="맑은 고딕" w:hAnsi="맑은 고딕"/>
+          <w:rFonts w:eastAsia="맑은 고딕"/>
+        </w:rPr>
+        <w:t>시연 영상 녹화용 데모 웹페이지(inference/demo_app.py) 제작</w:t>
+      </w:r>
+    </w:p>
+    <w:p>
+      <w:pPr>
+        <w:pStyle w:val="ListBullet"/>
+      </w:pPr>
+      <w:r>
+        <w:rPr>
+          <w:rFonts w:ascii="맑은 고딕" w:hAnsi="맑은 고딕"/>
+          <w:rFonts w:eastAsia="맑은 고딕"/>
+        </w:rPr>
+        <w:t>GitHub 저장소 구조 정리(.gitignore/LICENSE/테스트 등) 및 push 과정</w:t>
+      </w:r>
+    </w:p>
     <w:sectPr>
       <w:pgSz w:w="12240" w:h="15840"/>
       <w:pgMar w:top="1440" w:right="1800" w:bottom="1440" w:left="1800" w:header="720" w:footer="720" w:gutter="0"/>

</xml_diff>